<commit_message>
feat: tambah 5 Pesan Dakwah Terpenting ke resume Word
</commit_message>
<xml_diff>
--- a/Resume Kajian Tafsir QS Al Baqarah 26-27.docx
+++ b/Resume Kajian Tafsir QS Al Baqarah 26-27.docx
@@ -535,6 +535,204 @@
         <w:t>3. **Merujuk pada Ahli Ilmu:** Dalam mengelola kehidupan dan menghindari kerusakan, manusia wajib bertanya dan bersandar pada keahlian para pakar (ulama/profesor) di bidangnya masing-masing secara proporsional.</w:t>
       </w:r>
     </w:p>
+    <w:p>
+      <w:pPr>
+        <w:spacing w:before="320" w:after="120"/>
+      </w:pPr>
+      <w:r>
+        <w:rPr>
+          <w:rFonts w:ascii="Arial" w:hAnsi="Arial"/>
+          <w:b/>
+          <w:i w:val="0"/>
+          <w:color w:val="059669"/>
+          <w:sz w:val="26"/>
+        </w:rPr>
+        <w:t>5. Lima Pesan Dakwah Terpenting</w:t>
+      </w:r>
+    </w:p>
+    <w:p>
+      <w:pPr>
+        <w:spacing w:after="160"/>
+      </w:pPr>
+      <w:r>
+        <w:rPr>
+          <w:rFonts w:ascii="Arial" w:hAnsi="Arial"/>
+          <w:b w:val="0"/>
+          <w:i/>
+          <w:color w:val="6B7280"/>
+          <w:sz w:val="22"/>
+        </w:rPr>
+        <w:t>Berikut adalah lima pesan dakwah yang paling penting dari kajian tadabbur QS. Al-Baqarah ayat 26-27 oleh Ustaz Imamul Arifin, L.C., M.HI.:</w:t>
+      </w:r>
+    </w:p>
+    <w:p>
+      <w:pPr>
+        <w:spacing w:before="200" w:after="40"/>
+      </w:pPr>
+      <w:r>
+        <w:rPr>
+          <w:rFonts w:ascii="Arial" w:hAnsi="Arial"/>
+          <w:b/>
+          <w:i w:val="0"/>
+          <w:color w:val="D97706"/>
+          <w:sz w:val="23"/>
+        </w:rPr>
+        <w:t>Pesan 1: Merenungi Ciptaan Allah, Bukan Mempertanyakan Zat-Nya</w:t>
+      </w:r>
+    </w:p>
+    <w:p>
+      <w:pPr>
+        <w:spacing w:after="120" w:line="276" w:lineRule="auto"/>
+      </w:pPr>
+      <w:r>
+        <w:rPr>
+          <w:rFonts w:ascii="Arial" w:hAnsi="Arial"/>
+          <w:b w:val="0"/>
+          <w:i w:val="0"/>
+          <w:color w:val="1F2937"/>
+          <w:sz w:val="22"/>
+        </w:rPr>
+        <w:t>Manusia seharusnya menyibukkan akal dan hatinya untuk merenungi serta mentadaburi ciptaan-ciptaan Allah guna menemukan kebesaran-Nya. Bukan malah menyibukkan diri mempertanyakan wujud atau zat Allah SWT yang berada di luar jangkauan akal manusia. Dengan merenungi alam, manusia justru akan semakin bertambah keimanannya, sebagaimana diajarkan di akhir Surat Ali Imran tentang orang-orang yang berzikir sambil merenungi penciptaan langit dan bumi.</w:t>
+      </w:r>
+    </w:p>
+    <w:p>
+      <w:pPr>
+        <w:spacing w:before="200" w:after="40"/>
+      </w:pPr>
+      <w:r>
+        <w:rPr>
+          <w:rFonts w:ascii="Arial" w:hAnsi="Arial"/>
+          <w:b/>
+          <w:i w:val="0"/>
+          <w:color w:val="D97706"/>
+          <w:sz w:val="23"/>
+        </w:rPr>
+        <w:t>Pesan 2: Tidak Ada Ciptaan Allah yang Sia-sia — Sekecil Apa Pun</w:t>
+      </w:r>
+    </w:p>
+    <w:p>
+      <w:pPr>
+        <w:spacing w:after="120" w:line="276" w:lineRule="auto"/>
+      </w:pPr>
+      <w:r>
+        <w:rPr>
+          <w:rFonts w:ascii="Arial" w:hAnsi="Arial"/>
+          <w:b w:val="0"/>
+          <w:i w:val="0"/>
+          <w:color w:val="1F2937"/>
+          <w:sz w:val="22"/>
+        </w:rPr>
+        <w:t>Allah tidak segan membuat perumpamaan dengan seekor nyamuk atau makhluk yang lebih kecil darinya. Bahkan nyamuk saja membuka jutaan lapangan pekerjaan bagi manusia (pabrik obat nyamuk, kelambu, raket nyamuk, jasa penyemprotan, dll.). Virus corona yang jauh lebih kecil dari nyamuk pun mampu menggerakkan seluruh roda perekonomian dunia. Ini membuktikan bahwa setiap ciptaan Allah memiliki hikmah dan tujuan yang agung, meskipun tampak hina di mata manusia.</w:t>
+      </w:r>
+    </w:p>
+    <w:p>
+      <w:pPr>
+        <w:spacing w:before="200" w:after="40"/>
+      </w:pPr>
+      <w:r>
+        <w:rPr>
+          <w:rFonts w:ascii="Arial" w:hAnsi="Arial"/>
+          <w:b/>
+          <w:i w:val="0"/>
+          <w:color w:val="D97706"/>
+          <w:sz w:val="23"/>
+        </w:rPr>
+        <w:t>Pesan 3: Menjaga Janji Tauhid, Silaturahmi, dan Istiqomah Beribadah</w:t>
+      </w:r>
+    </w:p>
+    <w:p>
+      <w:pPr>
+        <w:spacing w:after="120" w:line="276" w:lineRule="auto"/>
+      </w:pPr>
+      <w:r>
+        <w:rPr>
+          <w:rFonts w:ascii="Arial" w:hAnsi="Arial"/>
+          <w:b w:val="0"/>
+          <w:i w:val="0"/>
+          <w:color w:val="1F2937"/>
+          <w:sz w:val="22"/>
+        </w:rPr>
+        <w:t>Kalimat syahadat (Asyhadu alla ilaha illallah wa asyhadu anna Muhammadar Rasulullah) bukan sekadar ucapan, melainkan perjanjian agung antara hamba dengan Tuhannya. Orang beriman wajib menjaga komitmen ini dengan tiga hal: (1) tidak menyekutukan Allah, (2) menyambung silaturahmi yang diperintahkan untuk disambung, dan (3) beribadah secara istiqomah tanpa 'cuti'. Memutus salah satu dari tiga hal ini adalah ciri orang fasik yang merugi dunia dan akhirat.</w:t>
+      </w:r>
+    </w:p>
+    <w:p>
+      <w:pPr>
+        <w:spacing w:before="200" w:after="40"/>
+      </w:pPr>
+      <w:r>
+        <w:rPr>
+          <w:rFonts w:ascii="Arial" w:hAnsi="Arial"/>
+          <w:b/>
+          <w:i w:val="0"/>
+          <w:color w:val="D97706"/>
+          <w:sz w:val="23"/>
+        </w:rPr>
+        <w:t>Pesan 4: Bersyukur atas Nikmat yang Sering Dilupakan</w:t>
+      </w:r>
+    </w:p>
+    <w:p>
+      <w:pPr>
+        <w:spacing w:after="120" w:line="276" w:lineRule="auto"/>
+      </w:pPr>
+      <w:r>
+        <w:rPr>
+          <w:rFonts w:ascii="Arial" w:hAnsi="Arial"/>
+          <w:b w:val="0"/>
+          <w:i w:val="0"/>
+          <w:color w:val="1F2937"/>
+          <w:sz w:val="22"/>
+        </w:rPr>
+        <w:t>Ustaz mengingatkan bahwa melihat kekurangan atau ujian pada orang lain seharusnya menjadi sarana untuk bercermin dan bersujud syukur kepada Allah, bukan untuk menghina atau memandang rendah. Contohnya, ketika melihat orang difabel atau yang memiliki keterbatasan fisik, seorang mukmin seharusnya berkata 'Ya Allah, alhamdulillah aku masih diberikan organ yang lengkap'. Bahkan di balik setiap ujian tersebut, Allah menyisipkan hikmah — seperti membuka lapangan kerja bagi orang-orang yang melayani mereka yang membutuhkan.</w:t>
+      </w:r>
+    </w:p>
+    <w:p>
+      <w:pPr>
+        <w:spacing w:before="200" w:after="40"/>
+      </w:pPr>
+      <w:r>
+        <w:rPr>
+          <w:rFonts w:ascii="Arial" w:hAnsi="Arial"/>
+          <w:b/>
+          <w:i w:val="0"/>
+          <w:color w:val="D97706"/>
+          <w:sz w:val="23"/>
+        </w:rPr>
+        <w:t>Pesan 5: Mensinergikan Ilmu Dunia dan Ilmu Akhirat</w:t>
+      </w:r>
+    </w:p>
+    <w:p>
+      <w:pPr>
+        <w:spacing w:after="120" w:line="276" w:lineRule="auto"/>
+      </w:pPr>
+      <w:r>
+        <w:rPr>
+          <w:rFonts w:ascii="Arial" w:hAnsi="Arial"/>
+          <w:b w:val="0"/>
+          <w:i w:val="0"/>
+          <w:color w:val="1F2937"/>
+          <w:sz w:val="22"/>
+        </w:rPr>
+        <w:t>Kerusakan di muka bumi seringkali terjadi karena manusia tidak menyelaraskan ilmu duniawi dengan panduan syariat agama. Ustaz menekankan pentingnya bertanya kepada ahlinya dalam setiap bidang — baik urusan teknik, hukum, kesehatan, maupun agama. Setiap disiplin ilmu memiliki 'ulamanya' sendiri. Mengabaikan hal ini adalah bentuk kerusakan (ifsad fil ardh) yang berujung pada kerugian besar, seperti kasus Lumpur Lapindo yang disebut sebagai contoh kegagalan mensinergikan keahlian teknis dengan tanggung jawab moral.</w:t>
+      </w:r>
+    </w:p>
+    <w:p>
+      <w:pPr>
+        <w:spacing w:before="360" w:after="480"/>
+        <w:jc w:val="center"/>
+      </w:pPr>
+      <w:r>
+        <w:rPr>
+          <w:rFonts w:ascii="Arial" w:hAnsi="Arial"/>
+          <w:b w:val="0"/>
+          <w:i/>
+          <w:color w:val="059669"/>
+          <w:sz w:val="21"/>
+        </w:rPr>
+        <w:t>"Semoga kita terhindar dari sifat-sifat orang fasik dan senantiasa menjadi hamba-hamba yang merenungi ciptaan Allah dengan penuh keimanan."</w:t>
+        <w:br/>
+        <w:t>— Ustaz Imamul Arifin, L.C., M.HI.</w:t>
+      </w:r>
+    </w:p>
     <w:sectPr>
       <w:pgSz w:w="12240" w:h="15840"/>
       <w:pgMar w:top="1440" w:right="1440" w:bottom="1440" w:left="1440" w:header="720" w:footer="720" w:gutter="0"/>

</xml_diff>